<commit_message>
Small updates after the initial push of the roza_cert_new, which includes template updates (removal of vertical line in the table) and creating a debug mode
</commit_message>
<xml_diff>
--- a/templates/roza_cert_new.docx
+++ b/templates/roza_cert_new.docx
@@ -5,22 +5,25 @@
     <w:tbl>
       <w:tblPr>
         <w:tblStyle w:val="TableGrid"/>
-        <w:tblW w:w="11335" w:type="dxa"/>
+        <w:tblW w:w="11348" w:type="dxa"/>
+        <w:tblBorders>
+          <w:insideV w:val="none" w:sz="0" w:space="0" w:color="auto"/>
+        </w:tblBorders>
         <w:tblLayout w:type="fixed"/>
         <w:tblLook w:val="04A0" w:firstRow="1" w:lastRow="0" w:firstColumn="1" w:lastColumn="0" w:noHBand="0" w:noVBand="1"/>
       </w:tblPr>
       <w:tblGrid>
-        <w:gridCol w:w="5667"/>
-        <w:gridCol w:w="5668"/>
+        <w:gridCol w:w="5674"/>
+        <w:gridCol w:w="5674"/>
       </w:tblGrid>
       <w:tr>
         <w:trPr>
           <w:cantSplit/>
-          <w:trHeight w:val="7949"/>
+          <w:trHeight w:hRule="exact" w:val="7949"/>
         </w:trPr>
         <w:tc>
           <w:tcPr>
-            <w:tcW w:w="5667" w:type="dxa"/>
+            <w:tcW w:w="5674" w:type="dxa"/>
           </w:tcPr>
           <w:p>
             <w:pPr>
@@ -116,6 +119,7 @@
                 <w:lang w:val="ru-RU"/>
               </w:rPr>
             </w:pPr>
+            <w:proofErr w:type="spellStart"/>
             <w:r>
               <w:rPr>
                 <w:rFonts w:cs="Times New Roman"/>
@@ -124,6 +128,7 @@
               </w:rPr>
               <w:t>profeduclogo</w:t>
             </w:r>
+            <w:proofErr w:type="spellEnd"/>
           </w:p>
           <w:p>
             <w:pPr>
@@ -302,6 +307,7 @@
                 <w:szCs w:val="24"/>
               </w:rPr>
             </w:pPr>
+            <w:proofErr w:type="gramStart"/>
             <w:r>
               <w:rPr>
                 <w:rFonts w:cs="Times New Roman"/>
@@ -311,6 +317,7 @@
               </w:rPr>
               <w:t xml:space="preserve">{{ </w:t>
             </w:r>
+            <w:proofErr w:type="spellStart"/>
             <w:r>
               <w:rPr>
                 <w:rFonts w:cs="Times New Roman"/>
@@ -320,6 +327,7 @@
               </w:rPr>
               <w:t>certificate</w:t>
             </w:r>
+            <w:proofErr w:type="gramEnd"/>
             <w:r>
               <w:rPr>
                 <w:rFonts w:cs="Times New Roman"/>
@@ -338,6 +346,7 @@
               </w:rPr>
               <w:t>number</w:t>
             </w:r>
+            <w:proofErr w:type="spellEnd"/>
             <w:r>
               <w:rPr>
                 <w:rFonts w:cs="Times New Roman"/>
@@ -416,13 +425,41 @@
                 <w:lang w:eastAsia="ru-RU"/>
               </w:rPr>
             </w:pPr>
+            <w:proofErr w:type="gramStart"/>
             <w:r>
               <w:rPr>
                 <w:rFonts w:cs="Times New Roman"/>
                 <w:b/>
                 <w:bCs/>
               </w:rPr>
-              <w:t>{{ end_date }}</w:t>
+              <w:t xml:space="preserve">{{ </w:t>
+            </w:r>
+            <w:proofErr w:type="spellStart"/>
+            <w:r>
+              <w:rPr>
+                <w:rFonts w:cs="Times New Roman"/>
+                <w:b/>
+                <w:bCs/>
+              </w:rPr>
+              <w:t>end</w:t>
+            </w:r>
+            <w:proofErr w:type="gramEnd"/>
+            <w:r>
+              <w:rPr>
+                <w:rFonts w:cs="Times New Roman"/>
+                <w:b/>
+                <w:bCs/>
+              </w:rPr>
+              <w:t>_date</w:t>
+            </w:r>
+            <w:proofErr w:type="spellEnd"/>
+            <w:r>
+              <w:rPr>
+                <w:rFonts w:cs="Times New Roman"/>
+                <w:b/>
+                <w:bCs/>
+              </w:rPr>
+              <w:t xml:space="preserve"> }}</w:t>
             </w:r>
           </w:p>
           <w:p>
@@ -483,7 +520,7 @@
         </w:tc>
         <w:tc>
           <w:tcPr>
-            <w:tcW w:w="5668" w:type="dxa"/>
+            <w:tcW w:w="5674" w:type="dxa"/>
           </w:tcPr>
           <w:p>
             <w:pPr>
@@ -524,6 +561,7 @@
                 <w:lang w:val="ru-RU"/>
               </w:rPr>
             </w:pPr>
+            <w:proofErr w:type="gramStart"/>
             <w:r>
               <w:rPr>
                 <w:rFonts w:cs="Times New Roman"/>
@@ -543,6 +581,7 @@
               </w:rPr>
               <w:t>student</w:t>
             </w:r>
+            <w:proofErr w:type="gramEnd"/>
             <w:r>
               <w:rPr>
                 <w:rFonts w:cs="Times New Roman"/>
@@ -601,13 +640,41 @@
               </w:rPr>
               <w:t xml:space="preserve"> </w:t>
             </w:r>
+            <w:proofErr w:type="gramStart"/>
             <w:r>
               <w:rPr>
                 <w:rFonts w:ascii="Times New Roman" w:hAnsi="Times New Roman" w:cs="Times New Roman"/>
                 <w:sz w:val="24"/>
                 <w:szCs w:val="24"/>
               </w:rPr>
-              <w:t xml:space="preserve">{{ beginning_date }} </w:t>
+              <w:t xml:space="preserve">{{ </w:t>
+            </w:r>
+            <w:proofErr w:type="spellStart"/>
+            <w:r>
+              <w:rPr>
+                <w:rFonts w:ascii="Times New Roman" w:hAnsi="Times New Roman" w:cs="Times New Roman"/>
+                <w:sz w:val="24"/>
+                <w:szCs w:val="24"/>
+              </w:rPr>
+              <w:t>beginning</w:t>
+            </w:r>
+            <w:proofErr w:type="gramEnd"/>
+            <w:r>
+              <w:rPr>
+                <w:rFonts w:ascii="Times New Roman" w:hAnsi="Times New Roman" w:cs="Times New Roman"/>
+                <w:sz w:val="24"/>
+                <w:szCs w:val="24"/>
+              </w:rPr>
+              <w:t>_date</w:t>
+            </w:r>
+            <w:proofErr w:type="spellEnd"/>
+            <w:r>
+              <w:rPr>
+                <w:rFonts w:ascii="Times New Roman" w:hAnsi="Times New Roman" w:cs="Times New Roman"/>
+                <w:sz w:val="24"/>
+                <w:szCs w:val="24"/>
+              </w:rPr>
+              <w:t xml:space="preserve"> }} </w:t>
             </w:r>
             <w:r>
               <w:rPr>
@@ -632,7 +699,25 @@
                 <w:sz w:val="24"/>
                 <w:szCs w:val="24"/>
               </w:rPr>
-              <w:t>{{ end_date }}</w:t>
+              <w:t xml:space="preserve">{{ </w:t>
+            </w:r>
+            <w:proofErr w:type="spellStart"/>
+            <w:r>
+              <w:rPr>
+                <w:rFonts w:ascii="Times New Roman" w:hAnsi="Times New Roman" w:cs="Times New Roman"/>
+                <w:sz w:val="24"/>
+                <w:szCs w:val="24"/>
+              </w:rPr>
+              <w:t>end_date</w:t>
+            </w:r>
+            <w:proofErr w:type="spellEnd"/>
+            <w:r>
+              <w:rPr>
+                <w:rFonts w:ascii="Times New Roman" w:hAnsi="Times New Roman" w:cs="Times New Roman"/>
+                <w:sz w:val="24"/>
+                <w:szCs w:val="24"/>
+              </w:rPr>
+              <w:t xml:space="preserve"> }}</w:t>
             </w:r>
           </w:p>
           <w:p>
@@ -691,6 +776,7 @@
               </w:rPr>
               <w:t xml:space="preserve">по профессии </w:t>
             </w:r>
+            <w:proofErr w:type="gramStart"/>
             <w:r>
               <w:rPr>
                 <w:rFonts w:ascii="Times New Roman" w:hAnsi="Times New Roman" w:cs="Times New Roman"/>
@@ -710,6 +796,7 @@
               </w:rPr>
               <w:t>student</w:t>
             </w:r>
+            <w:proofErr w:type="gramEnd"/>
             <w:r>
               <w:rPr>
                 <w:rFonts w:ascii="Times New Roman" w:hAnsi="Times New Roman" w:cs="Times New Roman"/>
@@ -770,6 +857,7 @@
               </w:rPr>
               <w:t xml:space="preserve"> </w:t>
             </w:r>
+            <w:proofErr w:type="gramStart"/>
             <w:r>
               <w:rPr>
                 <w:rFonts w:ascii="Times New Roman" w:hAnsi="Times New Roman" w:cs="Times New Roman"/>
@@ -787,6 +875,7 @@
               </w:rPr>
               <w:t>hours</w:t>
             </w:r>
+            <w:proofErr w:type="gramEnd"/>
             <w:r>
               <w:rPr>
                 <w:rFonts w:ascii="Times New Roman" w:hAnsi="Times New Roman" w:cs="Times New Roman"/>
@@ -843,7 +932,43 @@
                 <w:sz w:val="24"/>
                 <w:szCs w:val="24"/>
               </w:rPr>
-              <w:t xml:space="preserve"> {{ end_date }}</w:t>
+              <w:t xml:space="preserve"> </w:t>
+            </w:r>
+            <w:proofErr w:type="gramStart"/>
+            <w:r>
+              <w:rPr>
+                <w:rFonts w:ascii="Times New Roman" w:hAnsi="Times New Roman" w:cs="Times New Roman"/>
+                <w:sz w:val="24"/>
+                <w:szCs w:val="24"/>
+              </w:rPr>
+              <w:t xml:space="preserve">{{ </w:t>
+            </w:r>
+            <w:proofErr w:type="spellStart"/>
+            <w:r>
+              <w:rPr>
+                <w:rFonts w:ascii="Times New Roman" w:hAnsi="Times New Roman" w:cs="Times New Roman"/>
+                <w:sz w:val="24"/>
+                <w:szCs w:val="24"/>
+              </w:rPr>
+              <w:t>end</w:t>
+            </w:r>
+            <w:proofErr w:type="gramEnd"/>
+            <w:r>
+              <w:rPr>
+                <w:rFonts w:ascii="Times New Roman" w:hAnsi="Times New Roman" w:cs="Times New Roman"/>
+                <w:sz w:val="24"/>
+                <w:szCs w:val="24"/>
+              </w:rPr>
+              <w:t>_date</w:t>
+            </w:r>
+            <w:proofErr w:type="spellEnd"/>
+            <w:r>
+              <w:rPr>
+                <w:rFonts w:ascii="Times New Roman" w:hAnsi="Times New Roman" w:cs="Times New Roman"/>
+                <w:sz w:val="24"/>
+                <w:szCs w:val="24"/>
+              </w:rPr>
+              <w:t xml:space="preserve"> }}</w:t>
             </w:r>
             <w:r>
               <w:rPr>
@@ -876,7 +1001,25 @@
                 <w:sz w:val="24"/>
                 <w:szCs w:val="24"/>
               </w:rPr>
-              <w:t>{{ end_number }}</w:t>
+              <w:t xml:space="preserve">{{ </w:t>
+            </w:r>
+            <w:proofErr w:type="spellStart"/>
+            <w:r>
+              <w:rPr>
+                <w:rFonts w:ascii="Times New Roman" w:hAnsi="Times New Roman" w:cs="Times New Roman"/>
+                <w:sz w:val="24"/>
+                <w:szCs w:val="24"/>
+              </w:rPr>
+              <w:t>end_number</w:t>
+            </w:r>
+            <w:proofErr w:type="spellEnd"/>
+            <w:r>
+              <w:rPr>
+                <w:rFonts w:ascii="Times New Roman" w:hAnsi="Times New Roman" w:cs="Times New Roman"/>
+                <w:sz w:val="24"/>
+                <w:szCs w:val="24"/>
+              </w:rPr>
+              <w:t xml:space="preserve"> }}</w:t>
             </w:r>
           </w:p>
           <w:p>
@@ -934,13 +1077,41 @@
                 <w:szCs w:val="24"/>
               </w:rPr>
             </w:pPr>
+            <w:proofErr w:type="gramStart"/>
             <w:r>
               <w:rPr>
                 <w:rFonts w:ascii="Times New Roman" w:hAnsi="Times New Roman" w:cs="Times New Roman"/>
                 <w:sz w:val="24"/>
                 <w:szCs w:val="24"/>
               </w:rPr>
-              <w:t>{{ student_profession }}</w:t>
+              <w:t xml:space="preserve">{{ </w:t>
+            </w:r>
+            <w:proofErr w:type="spellStart"/>
+            <w:r>
+              <w:rPr>
+                <w:rFonts w:ascii="Times New Roman" w:hAnsi="Times New Roman" w:cs="Times New Roman"/>
+                <w:sz w:val="24"/>
+                <w:szCs w:val="24"/>
+              </w:rPr>
+              <w:t>student</w:t>
+            </w:r>
+            <w:proofErr w:type="gramEnd"/>
+            <w:r>
+              <w:rPr>
+                <w:rFonts w:ascii="Times New Roman" w:hAnsi="Times New Roman" w:cs="Times New Roman"/>
+                <w:sz w:val="24"/>
+                <w:szCs w:val="24"/>
+              </w:rPr>
+              <w:t>_profession</w:t>
+            </w:r>
+            <w:proofErr w:type="spellEnd"/>
+            <w:r>
+              <w:rPr>
+                <w:rFonts w:ascii="Times New Roman" w:hAnsi="Times New Roman" w:cs="Times New Roman"/>
+                <w:sz w:val="24"/>
+                <w:szCs w:val="24"/>
+              </w:rPr>
+              <w:t xml:space="preserve"> }}</w:t>
             </w:r>
             <w:r>
               <w:rPr>
@@ -1246,7 +1417,47 @@
                 <w:sz w:val="16"/>
                 <w:szCs w:val="16"/>
               </w:rPr>
-              <w:t>Л035-012540-01 00395964 от 14 июля 2021 г.</w:t>
+              <w:t xml:space="preserve">Л035-012540-01 00395964 </w:t>
+            </w:r>
+            <w:proofErr w:type="spellStart"/>
+            <w:r>
+              <w:rPr>
+                <w:rFonts w:cs="Times New Roman"/>
+                <w:b/>
+                <w:sz w:val="16"/>
+                <w:szCs w:val="16"/>
+              </w:rPr>
+              <w:t>от</w:t>
+            </w:r>
+            <w:proofErr w:type="spellEnd"/>
+            <w:r>
+              <w:rPr>
+                <w:rFonts w:cs="Times New Roman"/>
+                <w:b/>
+                <w:sz w:val="16"/>
+                <w:szCs w:val="16"/>
+              </w:rPr>
+              <w:t xml:space="preserve"> 14 </w:t>
+            </w:r>
+            <w:proofErr w:type="spellStart"/>
+            <w:r>
+              <w:rPr>
+                <w:rFonts w:cs="Times New Roman"/>
+                <w:b/>
+                <w:sz w:val="16"/>
+                <w:szCs w:val="16"/>
+              </w:rPr>
+              <w:t>июля</w:t>
+            </w:r>
+            <w:proofErr w:type="spellEnd"/>
+            <w:r>
+              <w:rPr>
+                <w:rFonts w:cs="Times New Roman"/>
+                <w:b/>
+                <w:sz w:val="16"/>
+                <w:szCs w:val="16"/>
+              </w:rPr>
+              <w:t xml:space="preserve"> 2021 г.</w:t>
             </w:r>
           </w:p>
         </w:tc>
@@ -1256,22 +1467,25 @@
     <w:tbl>
       <w:tblPr>
         <w:tblStyle w:val="TableGrid"/>
-        <w:tblW w:w="11335" w:type="dxa"/>
+        <w:tblW w:w="0" w:type="auto"/>
+        <w:tblBorders>
+          <w:insideV w:val="none" w:sz="0" w:space="0" w:color="auto"/>
+        </w:tblBorders>
         <w:tblLayout w:type="fixed"/>
         <w:tblLook w:val="04A0" w:firstRow="1" w:lastRow="0" w:firstColumn="1" w:lastColumn="0" w:noHBand="0" w:noVBand="1"/>
       </w:tblPr>
       <w:tblGrid>
-        <w:gridCol w:w="5667"/>
-        <w:gridCol w:w="5668"/>
+        <w:gridCol w:w="5674"/>
+        <w:gridCol w:w="5674"/>
       </w:tblGrid>
       <w:tr>
         <w:trPr>
           <w:cantSplit/>
-          <w:trHeight w:val="7952"/>
+          <w:trHeight w:hRule="exact" w:val="7949"/>
         </w:trPr>
         <w:tc>
           <w:tcPr>
-            <w:tcW w:w="5667" w:type="dxa"/>
+            <w:tcW w:w="5674" w:type="dxa"/>
           </w:tcPr>
           <w:p>
             <w:pPr>
@@ -1299,7 +1513,7 @@
         </w:tc>
         <w:tc>
           <w:tcPr>
-            <w:tcW w:w="5668" w:type="dxa"/>
+            <w:tcW w:w="5674" w:type="dxa"/>
             <w:vAlign w:val="center"/>
           </w:tcPr>
           <w:p>
@@ -1434,6 +1648,7 @@
                 <w:color w:val="365F91" w:themeColor="accent1" w:themeShade="BF"/>
               </w:rPr>
             </w:pPr>
+            <w:proofErr w:type="spellStart"/>
             <w:r>
               <w:rPr>
                 <w:rFonts w:cs="Times New Roman"/>
@@ -1441,6 +1656,7 @@
               </w:rPr>
               <w:t>bigger_educ_logo</w:t>
             </w:r>
+            <w:proofErr w:type="spellEnd"/>
           </w:p>
           <w:p>
             <w:pPr>
@@ -1635,6 +1851,7 @@
                     </w:rPr>
                     <w:t xml:space="preserve">г. Майкоп, ул. </w:t>
                   </w:r>
+                  <w:proofErr w:type="spellStart"/>
                   <w:r>
                     <w:rPr>
                       <w:rFonts w:ascii="Calibri" w:hAnsi="Calibri" w:cs="Arial"/>
@@ -1643,7 +1860,18 @@
                       <w:sz w:val="20"/>
                       <w:szCs w:val="20"/>
                     </w:rPr>
-                    <w:t>Котовского, 13-а</w:t>
+                    <w:t>Котовского</w:t>
+                  </w:r>
+                  <w:proofErr w:type="spellEnd"/>
+                  <w:r>
+                    <w:rPr>
+                      <w:rFonts w:ascii="Calibri" w:hAnsi="Calibri" w:cs="Arial"/>
+                      <w:b/>
+                      <w:color w:val="365F91" w:themeColor="accent1" w:themeShade="BF"/>
+                      <w:sz w:val="20"/>
+                      <w:szCs w:val="20"/>
+                    </w:rPr>
+                    <w:t>, 13-а</w:t>
                   </w:r>
                 </w:p>
               </w:tc>

</xml_diff>